<commit_message>
docs: document project analysis quality gate
</commit_message>
<xml_diff>
--- a/docs/generated/docx/developer/AI_Agent_Guide.docx
+++ b/docs/generated/docx/developer/AI_Agent_Guide.docx
@@ -5158,21 +5158,146 @@
       </w:r>
     </w:p>
     <w:bookmarkEnd w:id="43"/>
-    <w:bookmarkStart w:id="44" w:name="complete-diff-review"/>
+    <w:bookmarkStart w:id="44" w:name="project-analysis-agent"/>
     <w:p>
       <w:pPr>
         <w:pStyle w:val="Heading1"/>
       </w:pPr>
       <w:r>
-        <w:t xml:space="preserve">Complete Diff Review</w:t>
-      </w:r>
-    </w:p>
-    <w:p>
-      <w:pPr>
-        <w:pStyle w:val="FirstParagraph"/>
-      </w:pPr>
-      <w:r>
-        <w:t xml:space="preserve">Before commit review the complete diff.</w:t>
+        <w:t xml:space="preserve">Project Analysis Agent</w:t>
+      </w:r>
+    </w:p>
+    <w:p>
+      <w:pPr>
+        <w:pStyle w:val="FirstParagraph"/>
+      </w:pPr>
+      <w:r>
+        <w:t xml:space="preserve">The repository includes a read-only Project Analysis Agent:</w:t>
+      </w:r>
+    </w:p>
+    <w:p>
+      <w:pPr>
+        <w:pStyle w:val="SourceCode"/>
+      </w:pPr>
+      <w:r>
+        <w:rPr>
+          <w:rStyle w:val="VerbatimChar"/>
+        </w:rPr>
+        <w:t xml:space="preserve">python tools/project_analysis_agent.py .</w:t>
+      </w:r>
+    </w:p>
+    <w:p>
+      <w:pPr>
+        <w:pStyle w:val="FirstParagraph"/>
+      </w:pPr>
+      <w:r>
+        <w:t xml:space="preserve">The agent reports:</w:t>
+      </w:r>
+    </w:p>
+    <w:p>
+      <w:pPr>
+        <w:pStyle w:val="Compact"/>
+        <w:numPr>
+          <w:ilvl w:val="0"/>
+          <w:numId w:val="1033"/>
+        </w:numPr>
+      </w:pPr>
+      <w:r>
+        <w:t xml:space="preserve">project structure</w:t>
+      </w:r>
+    </w:p>
+    <w:p>
+      <w:pPr>
+        <w:pStyle w:val="Compact"/>
+        <w:numPr>
+          <w:ilvl w:val="0"/>
+          <w:numId w:val="1033"/>
+        </w:numPr>
+      </w:pPr>
+      <w:r>
+        <w:t xml:space="preserve">documentation checks</w:t>
+      </w:r>
+    </w:p>
+    <w:p>
+      <w:pPr>
+        <w:pStyle w:val="Compact"/>
+        <w:numPr>
+          <w:ilvl w:val="0"/>
+          <w:numId w:val="1033"/>
+        </w:numPr>
+      </w:pPr>
+      <w:r>
+        <w:t xml:space="preserve">architecture boundary checks</w:t>
+      </w:r>
+    </w:p>
+    <w:p>
+      <w:pPr>
+        <w:pStyle w:val="Compact"/>
+        <w:numPr>
+          <w:ilvl w:val="0"/>
+          <w:numId w:val="1033"/>
+        </w:numPr>
+      </w:pPr>
+      <w:r>
+        <w:t xml:space="preserve">trading safety hotspots</w:t>
+      </w:r>
+    </w:p>
+    <w:p>
+      <w:pPr>
+        <w:pStyle w:val="Compact"/>
+        <w:numPr>
+          <w:ilvl w:val="0"/>
+          <w:numId w:val="1033"/>
+        </w:numPr>
+      </w:pPr>
+      <w:r>
+        <w:t xml:space="preserve">safety scope</w:t>
+      </w:r>
+    </w:p>
+    <w:p>
+      <w:pPr>
+        <w:pStyle w:val="FirstParagraph"/>
+      </w:pPr>
+      <w:r>
+        <w:t xml:space="preserve">Machine-readable output is available through:</w:t>
+      </w:r>
+    </w:p>
+    <w:p>
+      <w:pPr>
+        <w:pStyle w:val="SourceCode"/>
+      </w:pPr>
+      <w:r>
+        <w:rPr>
+          <w:rStyle w:val="VerbatimChar"/>
+        </w:rPr>
+        <w:t xml:space="preserve">python tools/project_analysis_agent.py . --json</w:t>
+      </w:r>
+    </w:p>
+    <w:p>
+      <w:pPr>
+        <w:pStyle w:val="FirstParagraph"/>
+      </w:pPr>
+      <w:r>
+        <w:t xml:space="preserve">The CI quality gate uses:</w:t>
+      </w:r>
+    </w:p>
+    <w:p>
+      <w:pPr>
+        <w:pStyle w:val="SourceCode"/>
+      </w:pPr>
+      <w:r>
+        <w:rPr>
+          <w:rStyle w:val="VerbatimChar"/>
+        </w:rPr>
+        <w:t xml:space="preserve">python tools/project_analysis_agent.py . --fail-on-critical</w:t>
+      </w:r>
+    </w:p>
+    <w:p>
+      <w:pPr>
+        <w:pStyle w:val="FirstParagraph"/>
+      </w:pPr>
+      <w:r>
+        <w:t xml:space="preserve">AI agents shall treat critical findings as blocking unless explicitly instructed otherwise.</w:t>
       </w:r>
     </w:p>
     <w:p>
@@ -5180,99 +5305,7 @@
         <w:pStyle w:val="BodyText"/>
       </w:pPr>
       <w:r>
-        <w:t xml:space="preserve">Verify:</w:t>
-      </w:r>
-    </w:p>
-    <w:p>
-      <w:pPr>
-        <w:pStyle w:val="Compact"/>
-        <w:numPr>
-          <w:ilvl w:val="0"/>
-          <w:numId w:val="1033"/>
-        </w:numPr>
-      </w:pPr>
-      <w:r>
-        <w:t xml:space="preserve">only intended files changed</w:t>
-      </w:r>
-    </w:p>
-    <w:p>
-      <w:pPr>
-        <w:pStyle w:val="Compact"/>
-        <w:numPr>
-          <w:ilvl w:val="0"/>
-          <w:numId w:val="1033"/>
-        </w:numPr>
-      </w:pPr>
-      <w:r>
-        <w:t xml:space="preserve">no unrelated refactoring exists</w:t>
-      </w:r>
-    </w:p>
-    <w:p>
-      <w:pPr>
-        <w:pStyle w:val="Compact"/>
-        <w:numPr>
-          <w:ilvl w:val="0"/>
-          <w:numId w:val="1033"/>
-        </w:numPr>
-      </w:pPr>
-      <w:r>
-        <w:t xml:space="preserve">no debug code remains</w:t>
-      </w:r>
-    </w:p>
-    <w:p>
-      <w:pPr>
-        <w:pStyle w:val="Compact"/>
-        <w:numPr>
-          <w:ilvl w:val="0"/>
-          <w:numId w:val="1033"/>
-        </w:numPr>
-      </w:pPr>
-      <w:r>
-        <w:t xml:space="preserve">no temporary code remains</w:t>
-      </w:r>
-    </w:p>
-    <w:p>
-      <w:pPr>
-        <w:pStyle w:val="Compact"/>
-        <w:numPr>
-          <w:ilvl w:val="0"/>
-          <w:numId w:val="1033"/>
-        </w:numPr>
-      </w:pPr>
-      <w:r>
-        <w:t xml:space="preserve">no secrets were added</w:t>
-      </w:r>
-    </w:p>
-    <w:p>
-      <w:pPr>
-        <w:pStyle w:val="Compact"/>
-        <w:numPr>
-          <w:ilvl w:val="0"/>
-          <w:numId w:val="1033"/>
-        </w:numPr>
-      </w:pPr>
-      <w:r>
-        <w:t xml:space="preserve">tests match implementation</w:t>
-      </w:r>
-    </w:p>
-    <w:p>
-      <w:pPr>
-        <w:pStyle w:val="Compact"/>
-        <w:numPr>
-          <w:ilvl w:val="0"/>
-          <w:numId w:val="1033"/>
-        </w:numPr>
-      </w:pPr>
-      <w:r>
-        <w:t xml:space="preserve">documentation matches implementation</w:t>
-      </w:r>
-    </w:p>
-    <w:p>
-      <w:pPr>
-        <w:pStyle w:val="FirstParagraph"/>
-      </w:pPr>
-      <w:r>
-        <w:t xml:space="preserve">For trading-critical changes additionally verify:</w:t>
+        <w:t xml:space="preserve">Critical findings include:</w:t>
       </w:r>
     </w:p>
     <w:p>
@@ -5284,7 +5317,7 @@
         </w:numPr>
       </w:pPr>
       <w:r>
-        <w:t xml:space="preserve">external side effects</w:t>
+        <w:t xml:space="preserve">missing important documentation</w:t>
       </w:r>
     </w:p>
     <w:p>
@@ -5296,7 +5329,7 @@
         </w:numPr>
       </w:pPr>
       <w:r>
-        <w:t xml:space="preserve">state transitions</w:t>
+        <w:t xml:space="preserve">empty Markdown files</w:t>
       </w:r>
     </w:p>
     <w:p>
@@ -5308,7 +5341,7 @@
         </w:numPr>
       </w:pPr>
       <w:r>
-        <w:t xml:space="preserve">duplicate submission risk</w:t>
+        <w:t xml:space="preserve">placeholder Markdown files</w:t>
       </w:r>
     </w:p>
     <w:p>
@@ -5320,7 +5353,7 @@
         </w:numPr>
       </w:pPr>
       <w:r>
-        <w:t xml:space="preserve">retry behaviour</w:t>
+        <w:t xml:space="preserve">architecture import violations</w:t>
       </w:r>
     </w:p>
     <w:p>
@@ -5332,19 +5365,23 @@
         </w:numPr>
       </w:pPr>
       <w:r>
-        <w:t xml:space="preserve">PAPER and LIVE impact</w:t>
-      </w:r>
-    </w:p>
-    <w:p>
-      <w:pPr>
-        <w:pStyle w:val="Compact"/>
-        <w:numPr>
-          <w:ilvl w:val="0"/>
-          <w:numId w:val="1034"/>
-        </w:numPr>
-      </w:pPr>
-      <w:r>
-        <w:t xml:space="preserve">reconciliation impact</w:t>
+        <w:t xml:space="preserve">Python parse errors</w:t>
+      </w:r>
+    </w:p>
+    <w:p>
+      <w:pPr>
+        <w:pStyle w:val="FirstParagraph"/>
+      </w:pPr>
+      <w:r>
+        <w:t xml:space="preserve">Trading safety hotspots are report-only.</w:t>
+      </w:r>
+    </w:p>
+    <w:p>
+      <w:pPr>
+        <w:pStyle w:val="BodyText"/>
+      </w:pPr>
+      <w:r>
+        <w:t xml:space="preserve">They identify areas requiring review but do not automatically indicate a defect.</w:t>
       </w:r>
     </w:p>
     <w:p>
@@ -5355,21 +5392,29 @@
       </w:r>
     </w:p>
     <w:bookmarkEnd w:id="44"/>
-    <w:bookmarkStart w:id="45" w:name="communication"/>
+    <w:bookmarkStart w:id="45" w:name="complete-diff-review"/>
     <w:p>
       <w:pPr>
         <w:pStyle w:val="Heading1"/>
       </w:pPr>
       <w:r>
-        <w:t xml:space="preserve">Communication</w:t>
-      </w:r>
-    </w:p>
-    <w:p>
-      <w:pPr>
-        <w:pStyle w:val="FirstParagraph"/>
-      </w:pPr>
-      <w:r>
-        <w:t xml:space="preserve">Responses shall be:</w:t>
+        <w:t xml:space="preserve">Complete Diff Review</w:t>
+      </w:r>
+    </w:p>
+    <w:p>
+      <w:pPr>
+        <w:pStyle w:val="FirstParagraph"/>
+      </w:pPr>
+      <w:r>
+        <w:t xml:space="preserve">Before commit review the complete diff.</w:t>
+      </w:r>
+    </w:p>
+    <w:p>
+      <w:pPr>
+        <w:pStyle w:val="BodyText"/>
+      </w:pPr>
+      <w:r>
+        <w:t xml:space="preserve">Verify:</w:t>
       </w:r>
     </w:p>
     <w:p>
@@ -5381,7 +5426,7 @@
         </w:numPr>
       </w:pPr>
       <w:r>
-        <w:t xml:space="preserve">concise</w:t>
+        <w:t xml:space="preserve">only intended files changed</w:t>
       </w:r>
     </w:p>
     <w:p>
@@ -5393,7 +5438,7 @@
         </w:numPr>
       </w:pPr>
       <w:r>
-        <w:t xml:space="preserve">factual</w:t>
+        <w:t xml:space="preserve">no unrelated refactoring exists</w:t>
       </w:r>
     </w:p>
     <w:p>
@@ -5405,7 +5450,7 @@
         </w:numPr>
       </w:pPr>
       <w:r>
-        <w:t xml:space="preserve">implementation-oriented</w:t>
+        <w:t xml:space="preserve">no debug code remains</w:t>
       </w:r>
     </w:p>
     <w:p>
@@ -5417,15 +5462,51 @@
         </w:numPr>
       </w:pPr>
       <w:r>
-        <w:t xml:space="preserve">explicit about uncertainty</w:t>
-      </w:r>
-    </w:p>
-    <w:p>
-      <w:pPr>
-        <w:pStyle w:val="FirstParagraph"/>
-      </w:pPr>
-      <w:r>
-        <w:t xml:space="preserve">Avoid:</w:t>
+        <w:t xml:space="preserve">no temporary code remains</w:t>
+      </w:r>
+    </w:p>
+    <w:p>
+      <w:pPr>
+        <w:pStyle w:val="Compact"/>
+        <w:numPr>
+          <w:ilvl w:val="0"/>
+          <w:numId w:val="1035"/>
+        </w:numPr>
+      </w:pPr>
+      <w:r>
+        <w:t xml:space="preserve">no secrets were added</w:t>
+      </w:r>
+    </w:p>
+    <w:p>
+      <w:pPr>
+        <w:pStyle w:val="Compact"/>
+        <w:numPr>
+          <w:ilvl w:val="0"/>
+          <w:numId w:val="1035"/>
+        </w:numPr>
+      </w:pPr>
+      <w:r>
+        <w:t xml:space="preserve">tests match implementation</w:t>
+      </w:r>
+    </w:p>
+    <w:p>
+      <w:pPr>
+        <w:pStyle w:val="Compact"/>
+        <w:numPr>
+          <w:ilvl w:val="0"/>
+          <w:numId w:val="1035"/>
+        </w:numPr>
+      </w:pPr>
+      <w:r>
+        <w:t xml:space="preserve">documentation matches implementation</w:t>
+      </w:r>
+    </w:p>
+    <w:p>
+      <w:pPr>
+        <w:pStyle w:val="FirstParagraph"/>
+      </w:pPr>
+      <w:r>
+        <w:t xml:space="preserve">For trading-critical changes additionally verify:</w:t>
       </w:r>
     </w:p>
     <w:p>
@@ -5437,7 +5518,7 @@
         </w:numPr>
       </w:pPr>
       <w:r>
-        <w:t xml:space="preserve">repetition</w:t>
+        <w:t xml:space="preserve">external side effects</w:t>
       </w:r>
     </w:p>
     <w:p>
@@ -5449,7 +5530,7 @@
         </w:numPr>
       </w:pPr>
       <w:r>
-        <w:t xml:space="preserve">speculation</w:t>
+        <w:t xml:space="preserve">state transitions</w:t>
       </w:r>
     </w:p>
     <w:p>
@@ -5461,7 +5542,7 @@
         </w:numPr>
       </w:pPr>
       <w:r>
-        <w:t xml:space="preserve">invented repository details</w:t>
+        <w:t xml:space="preserve">duplicate submission risk</w:t>
       </w:r>
     </w:p>
     <w:p>
@@ -5473,7 +5554,7 @@
         </w:numPr>
       </w:pPr>
       <w:r>
-        <w:t xml:space="preserve">generic architecture lectures</w:t>
+        <w:t xml:space="preserve">retry behaviour</w:t>
       </w:r>
     </w:p>
     <w:p>
@@ -5485,23 +5566,19 @@
         </w:numPr>
       </w:pPr>
       <w:r>
-        <w:t xml:space="preserve">unnecessary alternatives after a direction is already established</w:t>
-      </w:r>
-    </w:p>
-    <w:p>
-      <w:pPr>
-        <w:pStyle w:val="FirstParagraph"/>
-      </w:pPr>
-      <w:r>
-        <w:t xml:space="preserve">If information is missing, state exactly what is missing.</w:t>
-      </w:r>
-    </w:p>
-    <w:p>
-      <w:pPr>
-        <w:pStyle w:val="BodyText"/>
-      </w:pPr>
-      <w:r>
-        <w:t xml:space="preserve">If a repository fact has not been verified, do not present it as verified.</w:t>
+        <w:t xml:space="preserve">PAPER and LIVE impact</w:t>
+      </w:r>
+    </w:p>
+    <w:p>
+      <w:pPr>
+        <w:pStyle w:val="Compact"/>
+        <w:numPr>
+          <w:ilvl w:val="0"/>
+          <w:numId w:val="1036"/>
+        </w:numPr>
+      </w:pPr>
+      <w:r>
+        <w:t xml:space="preserve">reconciliation impact</w:t>
       </w:r>
     </w:p>
     <w:p>
@@ -5512,21 +5589,21 @@
       </w:r>
     </w:p>
     <w:bookmarkEnd w:id="45"/>
-    <w:bookmarkStart w:id="46" w:name="approval"/>
+    <w:bookmarkStart w:id="46" w:name="communication"/>
     <w:p>
       <w:pPr>
         <w:pStyle w:val="Heading1"/>
       </w:pPr>
       <w:r>
-        <w:t xml:space="preserve">Approval</w:t>
-      </w:r>
-    </w:p>
-    <w:p>
-      <w:pPr>
-        <w:pStyle w:val="FirstParagraph"/>
-      </w:pPr>
-      <w:r>
-        <w:t xml:space="preserve">Wait for approval when:</w:t>
+        <w:t xml:space="preserve">Communication</w:t>
+      </w:r>
+    </w:p>
+    <w:p>
+      <w:pPr>
+        <w:pStyle w:val="FirstParagraph"/>
+      </w:pPr>
+      <w:r>
+        <w:t xml:space="preserve">Responses shall be:</w:t>
       </w:r>
     </w:p>
     <w:p>
@@ -5538,7 +5615,7 @@
         </w:numPr>
       </w:pPr>
       <w:r>
-        <w:t xml:space="preserve">the user explicitly requests approval before implementation</w:t>
+        <w:t xml:space="preserve">concise</w:t>
       </w:r>
     </w:p>
     <w:p>
@@ -5550,7 +5627,7 @@
         </w:numPr>
       </w:pPr>
       <w:r>
-        <w:t xml:space="preserve">multiple materially different architecture directions exist</w:t>
+        <w:t xml:space="preserve">factual</w:t>
       </w:r>
     </w:p>
     <w:p>
@@ -5562,7 +5639,7 @@
         </w:numPr>
       </w:pPr>
       <w:r>
-        <w:t xml:space="preserve">a trading-critical behaviour change is not clearly defined</w:t>
+        <w:t xml:space="preserve">implementation-oriented</w:t>
       </w:r>
     </w:p>
     <w:p>
@@ -5574,27 +5651,91 @@
         </w:numPr>
       </w:pPr>
       <w:r>
-        <w:t xml:space="preserve">a destructive migration is required</w:t>
-      </w:r>
-    </w:p>
-    <w:p>
-      <w:pPr>
-        <w:pStyle w:val="Compact"/>
-        <w:numPr>
-          <w:ilvl w:val="0"/>
-          <w:numId w:val="1037"/>
-        </w:numPr>
-      </w:pPr>
-      <w:r>
-        <w:t xml:space="preserve">a real public contract would be broken without an agreed migration</w:t>
-      </w:r>
-    </w:p>
-    <w:p>
-      <w:pPr>
-        <w:pStyle w:val="FirstParagraph"/>
-      </w:pPr>
-      <w:r>
-        <w:t xml:space="preserve">Do not request redundant approval for every routine implementation step when the requested change is already explicit.</w:t>
+        <w:t xml:space="preserve">explicit about uncertainty</w:t>
+      </w:r>
+    </w:p>
+    <w:p>
+      <w:pPr>
+        <w:pStyle w:val="FirstParagraph"/>
+      </w:pPr>
+      <w:r>
+        <w:t xml:space="preserve">Avoid:</w:t>
+      </w:r>
+    </w:p>
+    <w:p>
+      <w:pPr>
+        <w:pStyle w:val="Compact"/>
+        <w:numPr>
+          <w:ilvl w:val="0"/>
+          <w:numId w:val="1038"/>
+        </w:numPr>
+      </w:pPr>
+      <w:r>
+        <w:t xml:space="preserve">repetition</w:t>
+      </w:r>
+    </w:p>
+    <w:p>
+      <w:pPr>
+        <w:pStyle w:val="Compact"/>
+        <w:numPr>
+          <w:ilvl w:val="0"/>
+          <w:numId w:val="1038"/>
+        </w:numPr>
+      </w:pPr>
+      <w:r>
+        <w:t xml:space="preserve">speculation</w:t>
+      </w:r>
+    </w:p>
+    <w:p>
+      <w:pPr>
+        <w:pStyle w:val="Compact"/>
+        <w:numPr>
+          <w:ilvl w:val="0"/>
+          <w:numId w:val="1038"/>
+        </w:numPr>
+      </w:pPr>
+      <w:r>
+        <w:t xml:space="preserve">invented repository details</w:t>
+      </w:r>
+    </w:p>
+    <w:p>
+      <w:pPr>
+        <w:pStyle w:val="Compact"/>
+        <w:numPr>
+          <w:ilvl w:val="0"/>
+          <w:numId w:val="1038"/>
+        </w:numPr>
+      </w:pPr>
+      <w:r>
+        <w:t xml:space="preserve">generic architecture lectures</w:t>
+      </w:r>
+    </w:p>
+    <w:p>
+      <w:pPr>
+        <w:pStyle w:val="Compact"/>
+        <w:numPr>
+          <w:ilvl w:val="0"/>
+          <w:numId w:val="1038"/>
+        </w:numPr>
+      </w:pPr>
+      <w:r>
+        <w:t xml:space="preserve">unnecessary alternatives after a direction is already established</w:t>
+      </w:r>
+    </w:p>
+    <w:p>
+      <w:pPr>
+        <w:pStyle w:val="FirstParagraph"/>
+      </w:pPr>
+      <w:r>
+        <w:t xml:space="preserve">If information is missing, state exactly what is missing.</w:t>
+      </w:r>
+    </w:p>
+    <w:p>
+      <w:pPr>
+        <w:pStyle w:val="BodyText"/>
+      </w:pPr>
+      <w:r>
+        <w:t xml:space="preserve">If a repository fact has not been verified, do not present it as verified.</w:t>
       </w:r>
     </w:p>
     <w:p>
@@ -5605,121 +5746,89 @@
       </w:r>
     </w:p>
     <w:bookmarkEnd w:id="46"/>
-    <w:bookmarkStart w:id="47" w:name="commit-and-push"/>
+    <w:bookmarkStart w:id="47" w:name="approval"/>
     <w:p>
       <w:pPr>
         <w:pStyle w:val="Heading1"/>
       </w:pPr>
       <w:r>
-        <w:t xml:space="preserve">Commit and Push</w:t>
-      </w:r>
-    </w:p>
-    <w:p>
-      <w:pPr>
-        <w:pStyle w:val="FirstParagraph"/>
-      </w:pPr>
-      <w:r>
-        <w:t xml:space="preserve">Commit only after:</w:t>
-      </w:r>
-    </w:p>
-    <w:p>
-      <w:pPr>
-        <w:pStyle w:val="Compact"/>
-        <w:numPr>
-          <w:ilvl w:val="0"/>
-          <w:numId w:val="1038"/>
-        </w:numPr>
-      </w:pPr>
-      <w:r>
-        <w:t xml:space="preserve">implementation is complete</w:t>
-      </w:r>
-    </w:p>
-    <w:p>
-      <w:pPr>
-        <w:pStyle w:val="Compact"/>
-        <w:numPr>
-          <w:ilvl w:val="0"/>
-          <w:numId w:val="1038"/>
-        </w:numPr>
-      </w:pPr>
-      <w:r>
-        <w:t xml:space="preserve">relevant tests pass</w:t>
-      </w:r>
-    </w:p>
-    <w:p>
-      <w:pPr>
-        <w:pStyle w:val="Compact"/>
-        <w:numPr>
-          <w:ilvl w:val="0"/>
-          <w:numId w:val="1038"/>
-        </w:numPr>
-      </w:pPr>
-      <w:r>
-        <w:t xml:space="preserve">required regression tests pass</w:t>
-      </w:r>
-    </w:p>
-    <w:p>
-      <w:pPr>
-        <w:pStyle w:val="Compact"/>
-        <w:numPr>
-          <w:ilvl w:val="0"/>
-          <w:numId w:val="1038"/>
-        </w:numPr>
-      </w:pPr>
-      <w:r>
-        <w:t xml:space="preserve">source quality checks pass</w:t>
-      </w:r>
-    </w:p>
-    <w:p>
-      <w:pPr>
-        <w:pStyle w:val="Compact"/>
-        <w:numPr>
-          <w:ilvl w:val="0"/>
-          <w:numId w:val="1038"/>
-        </w:numPr>
-      </w:pPr>
-      <w:r>
-        <w:t xml:space="preserve">documentation is synchronized</w:t>
-      </w:r>
-    </w:p>
-    <w:p>
-      <w:pPr>
-        <w:pStyle w:val="Compact"/>
-        <w:numPr>
-          <w:ilvl w:val="0"/>
-          <w:numId w:val="1038"/>
-        </w:numPr>
-      </w:pPr>
-      <w:r>
-        <w:t xml:space="preserve">documentation generation passes where required</w:t>
-      </w:r>
-    </w:p>
-    <w:p>
-      <w:pPr>
-        <w:pStyle w:val="Compact"/>
-        <w:numPr>
-          <w:ilvl w:val="0"/>
-          <w:numId w:val="1038"/>
-        </w:numPr>
-      </w:pPr>
-      <w:r>
-        <w:t xml:space="preserve">complete diff is reviewed</w:t>
-      </w:r>
-    </w:p>
-    <w:p>
-      <w:pPr>
-        <w:pStyle w:val="FirstParagraph"/>
-      </w:pPr>
-      <w:r>
-        <w:t xml:space="preserve">Push after local verification and commit.</w:t>
-      </w:r>
-    </w:p>
-    <w:p>
-      <w:pPr>
-        <w:pStyle w:val="BodyText"/>
-      </w:pPr>
-      <w:r>
-        <w:t xml:space="preserve">A successful push does not replace CI validation.</w:t>
+        <w:t xml:space="preserve">Approval</w:t>
+      </w:r>
+    </w:p>
+    <w:p>
+      <w:pPr>
+        <w:pStyle w:val="FirstParagraph"/>
+      </w:pPr>
+      <w:r>
+        <w:t xml:space="preserve">Wait for approval when:</w:t>
+      </w:r>
+    </w:p>
+    <w:p>
+      <w:pPr>
+        <w:pStyle w:val="Compact"/>
+        <w:numPr>
+          <w:ilvl w:val="0"/>
+          <w:numId w:val="1039"/>
+        </w:numPr>
+      </w:pPr>
+      <w:r>
+        <w:t xml:space="preserve">the user explicitly requests approval before implementation</w:t>
+      </w:r>
+    </w:p>
+    <w:p>
+      <w:pPr>
+        <w:pStyle w:val="Compact"/>
+        <w:numPr>
+          <w:ilvl w:val="0"/>
+          <w:numId w:val="1039"/>
+        </w:numPr>
+      </w:pPr>
+      <w:r>
+        <w:t xml:space="preserve">multiple materially different architecture directions exist</w:t>
+      </w:r>
+    </w:p>
+    <w:p>
+      <w:pPr>
+        <w:pStyle w:val="Compact"/>
+        <w:numPr>
+          <w:ilvl w:val="0"/>
+          <w:numId w:val="1039"/>
+        </w:numPr>
+      </w:pPr>
+      <w:r>
+        <w:t xml:space="preserve">a trading-critical behaviour change is not clearly defined</w:t>
+      </w:r>
+    </w:p>
+    <w:p>
+      <w:pPr>
+        <w:pStyle w:val="Compact"/>
+        <w:numPr>
+          <w:ilvl w:val="0"/>
+          <w:numId w:val="1039"/>
+        </w:numPr>
+      </w:pPr>
+      <w:r>
+        <w:t xml:space="preserve">a destructive migration is required</w:t>
+      </w:r>
+    </w:p>
+    <w:p>
+      <w:pPr>
+        <w:pStyle w:val="Compact"/>
+        <w:numPr>
+          <w:ilvl w:val="0"/>
+          <w:numId w:val="1039"/>
+        </w:numPr>
+      </w:pPr>
+      <w:r>
+        <w:t xml:space="preserve">a real public contract would be broken without an agreed migration</w:t>
+      </w:r>
+    </w:p>
+    <w:p>
+      <w:pPr>
+        <w:pStyle w:val="FirstParagraph"/>
+      </w:pPr>
+      <w:r>
+        <w:t xml:space="preserve">Do not request redundant approval for every routine implementation step when the requested change is already explicit.</w:t>
       </w:r>
     </w:p>
     <w:p>
@@ -5730,89 +5839,41 @@
       </w:r>
     </w:p>
     <w:bookmarkEnd w:id="47"/>
-    <w:bookmarkStart w:id="48" w:name="definition-of-success"/>
+    <w:bookmarkStart w:id="48" w:name="commit-and-push"/>
     <w:p>
       <w:pPr>
         <w:pStyle w:val="Heading1"/>
       </w:pPr>
       <w:r>
-        <w:t xml:space="preserve">Definition of Success</w:t>
-      </w:r>
-    </w:p>
-    <w:p>
-      <w:pPr>
-        <w:pStyle w:val="FirstParagraph"/>
-      </w:pPr>
-      <w:r>
-        <w:t xml:space="preserve">A task is complete only when:</w:t>
-      </w:r>
-    </w:p>
-    <w:p>
-      <w:pPr>
-        <w:pStyle w:val="Compact"/>
-        <w:numPr>
-          <w:ilvl w:val="0"/>
-          <w:numId w:val="1039"/>
-        </w:numPr>
-      </w:pPr>
-      <w:r>
-        <w:t xml:space="preserve">the requested requirement is implemented</w:t>
-      </w:r>
-    </w:p>
-    <w:p>
-      <w:pPr>
-        <w:pStyle w:val="Compact"/>
-        <w:numPr>
-          <w:ilvl w:val="0"/>
-          <w:numId w:val="1039"/>
-        </w:numPr>
-      </w:pPr>
-      <w:r>
-        <w:t xml:space="preserve">architecture boundaries remain consistent</w:t>
-      </w:r>
-    </w:p>
-    <w:p>
-      <w:pPr>
-        <w:pStyle w:val="Compact"/>
-        <w:numPr>
-          <w:ilvl w:val="0"/>
-          <w:numId w:val="1039"/>
-        </w:numPr>
-      </w:pPr>
-      <w:r>
-        <w:t xml:space="preserve">capability ownership remains clear</w:t>
-      </w:r>
-    </w:p>
-    <w:p>
-      <w:pPr>
-        <w:pStyle w:val="Compact"/>
-        <w:numPr>
-          <w:ilvl w:val="0"/>
-          <w:numId w:val="1039"/>
-        </w:numPr>
-      </w:pPr>
-      <w:r>
-        <w:t xml:space="preserve">side effects are explicit</w:t>
-      </w:r>
-    </w:p>
-    <w:p>
-      <w:pPr>
-        <w:pStyle w:val="Compact"/>
-        <w:numPr>
-          <w:ilvl w:val="0"/>
-          <w:numId w:val="1039"/>
-        </w:numPr>
-      </w:pPr>
-      <w:r>
-        <w:t xml:space="preserve">state transitions are deterministic</w:t>
-      </w:r>
-    </w:p>
-    <w:p>
-      <w:pPr>
-        <w:pStyle w:val="Compact"/>
-        <w:numPr>
-          <w:ilvl w:val="0"/>
-          <w:numId w:val="1039"/>
+        <w:t xml:space="preserve">Commit and Push</w:t>
+      </w:r>
+    </w:p>
+    <w:p>
+      <w:pPr>
+        <w:pStyle w:val="FirstParagraph"/>
+      </w:pPr>
+      <w:r>
+        <w:t xml:space="preserve">Commit only after:</w:t>
+      </w:r>
+    </w:p>
+    <w:p>
+      <w:pPr>
+        <w:pStyle w:val="Compact"/>
+        <w:numPr>
+          <w:ilvl w:val="0"/>
+          <w:numId w:val="1040"/>
+        </w:numPr>
+      </w:pPr>
+      <w:r>
+        <w:t xml:space="preserve">implementation is complete</w:t>
+      </w:r>
+    </w:p>
+    <w:p>
+      <w:pPr>
+        <w:pStyle w:val="Compact"/>
+        <w:numPr>
+          <w:ilvl w:val="0"/>
+          <w:numId w:val="1040"/>
         </w:numPr>
       </w:pPr>
       <w:r>
@@ -5824,19 +5885,31 @@
         <w:pStyle w:val="Compact"/>
         <w:numPr>
           <w:ilvl w:val="0"/>
-          <w:numId w:val="1039"/>
-        </w:numPr>
-      </w:pPr>
-      <w:r>
-        <w:t xml:space="preserve">trading regression scenarios pass where required</w:t>
-      </w:r>
-    </w:p>
-    <w:p>
-      <w:pPr>
-        <w:pStyle w:val="Compact"/>
-        <w:numPr>
-          <w:ilvl w:val="0"/>
-          <w:numId w:val="1039"/>
+          <w:numId w:val="1040"/>
+        </w:numPr>
+      </w:pPr>
+      <w:r>
+        <w:t xml:space="preserve">required regression tests pass</w:t>
+      </w:r>
+    </w:p>
+    <w:p>
+      <w:pPr>
+        <w:pStyle w:val="Compact"/>
+        <w:numPr>
+          <w:ilvl w:val="0"/>
+          <w:numId w:val="1040"/>
+        </w:numPr>
+      </w:pPr>
+      <w:r>
+        <w:t xml:space="preserve">source quality checks pass</w:t>
+      </w:r>
+    </w:p>
+    <w:p>
+      <w:pPr>
+        <w:pStyle w:val="Compact"/>
+        <w:numPr>
+          <w:ilvl w:val="0"/>
+          <w:numId w:val="1040"/>
         </w:numPr>
       </w:pPr>
       <w:r>
@@ -5848,7 +5921,7 @@
         <w:pStyle w:val="Compact"/>
         <w:numPr>
           <w:ilvl w:val="0"/>
-          <w:numId w:val="1039"/>
+          <w:numId w:val="1040"/>
         </w:numPr>
       </w:pPr>
       <w:r>
@@ -5860,19 +5933,7 @@
         <w:pStyle w:val="Compact"/>
         <w:numPr>
           <w:ilvl w:val="0"/>
-          <w:numId w:val="1039"/>
-        </w:numPr>
-      </w:pPr>
-      <w:r>
-        <w:t xml:space="preserve">source quality checks pass</w:t>
-      </w:r>
-    </w:p>
-    <w:p>
-      <w:pPr>
-        <w:pStyle w:val="Compact"/>
-        <w:numPr>
-          <w:ilvl w:val="0"/>
-          <w:numId w:val="1039"/>
+          <w:numId w:val="1040"/>
         </w:numPr>
       </w:pPr>
       <w:r>
@@ -5881,22 +5942,10 @@
     </w:p>
     <w:p>
       <w:pPr>
-        <w:pStyle w:val="Compact"/>
-        <w:numPr>
-          <w:ilvl w:val="0"/>
-          <w:numId w:val="1039"/>
-        </w:numPr>
-      </w:pPr>
-      <w:r>
-        <w:t xml:space="preserve">changes are ready for repository integration</w:t>
-      </w:r>
-    </w:p>
-    <w:p>
-      <w:pPr>
-        <w:pStyle w:val="FirstParagraph"/>
-      </w:pPr>
-      <w:r>
-        <w:t xml:space="preserve">For the standard development workflow, completion also includes commit and push.</w:t>
+        <w:pStyle w:val="FirstParagraph"/>
+      </w:pPr>
+      <w:r>
+        <w:t xml:space="preserve">Push after local verification and commit.</w:t>
       </w:r>
     </w:p>
     <w:p>
@@ -5904,7 +5953,7 @@
         <w:pStyle w:val="BodyText"/>
       </w:pPr>
       <w:r>
-        <w:t xml:space="preserve">A task with known unresolved trading-critical behaviour is not complete.</w:t>
+        <w:t xml:space="preserve">A successful push does not replace CI validation.</w:t>
       </w:r>
     </w:p>
     <w:p>
@@ -5915,417 +5964,181 @@
       </w:r>
     </w:p>
     <w:bookmarkEnd w:id="48"/>
-    <w:bookmarkStart w:id="49" w:name="ai-agent-review-checklist"/>
+    <w:bookmarkStart w:id="49" w:name="definition-of-success"/>
     <w:p>
       <w:pPr>
         <w:pStyle w:val="Heading1"/>
       </w:pPr>
       <w:r>
-        <w:t xml:space="preserve">AI Agent Review Checklist</w:t>
-      </w:r>
-    </w:p>
-    <w:p>
-      <w:pPr>
-        <w:pStyle w:val="FirstParagraph"/>
-      </w:pPr>
-      <w:r>
-        <w:t xml:space="preserve">Before completing a task verify:</w:t>
-      </w:r>
-    </w:p>
-    <w:p>
-      <w:pPr>
-        <w:pStyle w:val="Compact"/>
-        <w:numPr>
-          <w:ilvl w:val="0"/>
-          <w:numId w:val="1040"/>
-        </w:numPr>
-      </w:pPr>
-      <w:r>
-        <w:t xml:space="preserve">current repository inspected</w:t>
-      </w:r>
-    </w:p>
-    <w:p>
-      <w:pPr>
-        <w:pStyle w:val="Compact"/>
-        <w:numPr>
-          <w:ilvl w:val="0"/>
-          <w:numId w:val="1040"/>
-        </w:numPr>
-      </w:pPr>
-      <w:r>
-        <w:t xml:space="preserve">affected files inspected</w:t>
-      </w:r>
-    </w:p>
-    <w:p>
-      <w:pPr>
-        <w:pStyle w:val="Compact"/>
-        <w:numPr>
-          <w:ilvl w:val="0"/>
-          <w:numId w:val="1040"/>
-        </w:numPr>
-      </w:pPr>
-      <w:r>
-        <w:t xml:space="preserve">direct callers inspected</w:t>
-      </w:r>
-    </w:p>
-    <w:p>
-      <w:pPr>
-        <w:pStyle w:val="Compact"/>
-        <w:numPr>
-          <w:ilvl w:val="0"/>
-          <w:numId w:val="1040"/>
-        </w:numPr>
-      </w:pPr>
-      <w:r>
-        <w:t xml:space="preserve">direct dependencies inspected</w:t>
-      </w:r>
-    </w:p>
-    <w:p>
-      <w:pPr>
-        <w:pStyle w:val="Compact"/>
-        <w:numPr>
-          <w:ilvl w:val="0"/>
-          <w:numId w:val="1040"/>
-        </w:numPr>
-      </w:pPr>
-      <w:r>
-        <w:t xml:space="preserve">related tests inspected</w:t>
-      </w:r>
-    </w:p>
-    <w:p>
-      <w:pPr>
-        <w:pStyle w:val="Compact"/>
-        <w:numPr>
-          <w:ilvl w:val="0"/>
-          <w:numId w:val="1040"/>
-        </w:numPr>
-      </w:pPr>
-      <w:r>
-        <w:t xml:space="preserve">related Markdown documentation inspected</w:t>
-      </w:r>
-    </w:p>
-    <w:p>
-      <w:pPr>
-        <w:pStyle w:val="Compact"/>
-        <w:numPr>
-          <w:ilvl w:val="0"/>
-          <w:numId w:val="1040"/>
-        </w:numPr>
-      </w:pPr>
-      <w:r>
-        <w:t xml:space="preserve">owning capability identified</w:t>
-      </w:r>
-    </w:p>
-    <w:p>
-      <w:pPr>
-        <w:pStyle w:val="Compact"/>
-        <w:numPr>
-          <w:ilvl w:val="0"/>
-          <w:numId w:val="1040"/>
-        </w:numPr>
-      </w:pPr>
-      <w:r>
-        <w:t xml:space="preserve">architecture layer identified</w:t>
-      </w:r>
-    </w:p>
-    <w:p>
-      <w:pPr>
-        <w:pStyle w:val="Compact"/>
-        <w:numPr>
-          <w:ilvl w:val="0"/>
-          <w:numId w:val="1040"/>
-        </w:numPr>
-      </w:pPr>
-      <w:r>
-        <w:t xml:space="preserve">smallest meaningful change selected</w:t>
-      </w:r>
-    </w:p>
-    <w:p>
-      <w:pPr>
-        <w:pStyle w:val="Compact"/>
-        <w:numPr>
-          <w:ilvl w:val="0"/>
-          <w:numId w:val="1040"/>
-        </w:numPr>
-      </w:pPr>
-      <w:r>
-        <w:t xml:space="preserve">no repository details invented</w:t>
-      </w:r>
-    </w:p>
-    <w:p>
-      <w:pPr>
-        <w:pStyle w:val="Compact"/>
-        <w:numPr>
-          <w:ilvl w:val="0"/>
-          <w:numId w:val="1040"/>
-        </w:numPr>
-      </w:pPr>
-      <w:r>
-        <w:t xml:space="preserve">side effects identified</w:t>
-      </w:r>
-    </w:p>
-    <w:p>
-      <w:pPr>
-        <w:pStyle w:val="Compact"/>
-        <w:numPr>
-          <w:ilvl w:val="0"/>
-          <w:numId w:val="1040"/>
-        </w:numPr>
-      </w:pPr>
-      <w:r>
-        <w:t xml:space="preserve">state transitions identified</w:t>
-      </w:r>
-    </w:p>
-    <w:p>
-      <w:pPr>
-        <w:pStyle w:val="Compact"/>
-        <w:numPr>
-          <w:ilvl w:val="0"/>
-          <w:numId w:val="1040"/>
-        </w:numPr>
-      </w:pPr>
-      <w:r>
-        <w:t xml:space="preserve">financial availability semantics preserved</w:t>
-      </w:r>
-    </w:p>
-    <w:p>
-      <w:pPr>
-        <w:pStyle w:val="Compact"/>
-        <w:numPr>
-          <w:ilvl w:val="0"/>
-          <w:numId w:val="1040"/>
-        </w:numPr>
-      </w:pPr>
-      <w:r>
-        <w:t xml:space="preserve">async task ownership evaluated</w:t>
-      </w:r>
-    </w:p>
-    <w:p>
-      <w:pPr>
-        <w:pStyle w:val="Compact"/>
-        <w:numPr>
-          <w:ilvl w:val="0"/>
-          <w:numId w:val="1040"/>
-        </w:numPr>
-      </w:pPr>
-      <w:r>
-        <w:t xml:space="preserve">timeout behaviour evaluated</w:t>
-      </w:r>
-    </w:p>
-    <w:p>
-      <w:pPr>
-        <w:pStyle w:val="Compact"/>
-        <w:numPr>
-          <w:ilvl w:val="0"/>
-          <w:numId w:val="1040"/>
-        </w:numPr>
-      </w:pPr>
-      <w:r>
-        <w:t xml:space="preserve">cancellation evaluated</w:t>
-      </w:r>
-    </w:p>
-    <w:p>
-      <w:pPr>
-        <w:pStyle w:val="Compact"/>
-        <w:numPr>
-          <w:ilvl w:val="0"/>
-          <w:numId w:val="1040"/>
-        </w:numPr>
-      </w:pPr>
-      <w:r>
-        <w:t xml:space="preserve">duplicate submission risk evaluated where relevant</w:t>
-      </w:r>
-    </w:p>
-    <w:p>
-      <w:pPr>
-        <w:pStyle w:val="Compact"/>
-        <w:numPr>
-          <w:ilvl w:val="0"/>
-          <w:numId w:val="1040"/>
-        </w:numPr>
-      </w:pPr>
-      <w:r>
-        <w:t xml:space="preserve">retry behaviour evaluated where relevant</w:t>
-      </w:r>
-    </w:p>
-    <w:p>
-      <w:pPr>
-        <w:pStyle w:val="Compact"/>
-        <w:numPr>
-          <w:ilvl w:val="0"/>
-          <w:numId w:val="1040"/>
-        </w:numPr>
-      </w:pPr>
-      <w:r>
-        <w:t xml:space="preserve">broker acknowledgement semantics evaluated where relevant</w:t>
-      </w:r>
-    </w:p>
-    <w:p>
-      <w:pPr>
-        <w:pStyle w:val="Compact"/>
-        <w:numPr>
-          <w:ilvl w:val="0"/>
-          <w:numId w:val="1040"/>
-        </w:numPr>
-      </w:pPr>
-      <w:r>
-        <w:t xml:space="preserve">reconnect behaviour evaluated where relevant</w:t>
-      </w:r>
-    </w:p>
-    <w:p>
-      <w:pPr>
-        <w:pStyle w:val="Compact"/>
-        <w:numPr>
-          <w:ilvl w:val="0"/>
-          <w:numId w:val="1040"/>
-        </w:numPr>
-      </w:pPr>
-      <w:r>
-        <w:t xml:space="preserve">reconciliation impact evaluated where relevant</w:t>
-      </w:r>
-    </w:p>
-    <w:p>
-      <w:pPr>
-        <w:pStyle w:val="Compact"/>
-        <w:numPr>
-          <w:ilvl w:val="0"/>
-          <w:numId w:val="1040"/>
-        </w:numPr>
-      </w:pPr>
-      <w:r>
-        <w:t xml:space="preserve">PAPER and LIVE impact evaluated where relevant</w:t>
-      </w:r>
-    </w:p>
-    <w:p>
-      <w:pPr>
-        <w:pStyle w:val="Compact"/>
-        <w:numPr>
-          <w:ilvl w:val="0"/>
-          <w:numId w:val="1040"/>
-        </w:numPr>
-      </w:pPr>
-      <w:r>
-        <w:t xml:space="preserve">tests added or updated</w:t>
-      </w:r>
-    </w:p>
-    <w:p>
-      <w:pPr>
-        <w:pStyle w:val="Compact"/>
-        <w:numPr>
-          <w:ilvl w:val="0"/>
-          <w:numId w:val="1040"/>
-        </w:numPr>
-      </w:pPr>
-      <w:r>
-        <w:t xml:space="preserve">focused tests passed</w:t>
-      </w:r>
-    </w:p>
-    <w:p>
-      <w:pPr>
-        <w:pStyle w:val="Compact"/>
-        <w:numPr>
-          <w:ilvl w:val="0"/>
-          <w:numId w:val="1040"/>
-        </w:numPr>
-      </w:pPr>
-      <w:r>
-        <w:t xml:space="preserve">required regression tests passed</w:t>
-      </w:r>
-    </w:p>
-    <w:p>
-      <w:pPr>
-        <w:pStyle w:val="Compact"/>
-        <w:numPr>
-          <w:ilvl w:val="0"/>
-          <w:numId w:val="1040"/>
-        </w:numPr>
-      </w:pPr>
-      <w:r>
-        <w:t xml:space="preserve">Ruff passed</w:t>
-      </w:r>
-    </w:p>
-    <w:p>
-      <w:pPr>
-        <w:pStyle w:val="Compact"/>
-        <w:numPr>
-          <w:ilvl w:val="0"/>
-          <w:numId w:val="1040"/>
-        </w:numPr>
-      </w:pPr>
-      <w:r>
-        <w:t xml:space="preserve">formatting verification passed</w:t>
-      </w:r>
-    </w:p>
-    <w:p>
-      <w:pPr>
-        <w:pStyle w:val="Compact"/>
-        <w:numPr>
-          <w:ilvl w:val="0"/>
-          <w:numId w:val="1040"/>
-        </w:numPr>
-      </w:pPr>
-      <w:r>
-        <w:t xml:space="preserve">documentation synchronized</w:t>
-      </w:r>
-    </w:p>
-    <w:p>
-      <w:pPr>
-        <w:pStyle w:val="Compact"/>
-        <w:numPr>
-          <w:ilvl w:val="0"/>
-          <w:numId w:val="1040"/>
-        </w:numPr>
-      </w:pPr>
-      <w:r>
-        <w:t xml:space="preserve">documentation generation passed where required</w:t>
-      </w:r>
-    </w:p>
-    <w:p>
-      <w:pPr>
-        <w:pStyle w:val="Compact"/>
-        <w:numPr>
-          <w:ilvl w:val="0"/>
-          <w:numId w:val="1040"/>
-        </w:numPr>
-      </w:pPr>
-      <w:r>
-        <w:t xml:space="preserve">complete diff reviewed</w:t>
-      </w:r>
-    </w:p>
-    <w:p>
-      <w:pPr>
-        <w:pStyle w:val="Compact"/>
-        <w:numPr>
-          <w:ilvl w:val="0"/>
-          <w:numId w:val="1040"/>
-        </w:numPr>
-      </w:pPr>
-      <w:r>
-        <w:t xml:space="preserve">no secrets exposed</w:t>
-      </w:r>
-    </w:p>
-    <w:p>
-      <w:pPr>
-        <w:pStyle w:val="Compact"/>
-        <w:numPr>
-          <w:ilvl w:val="0"/>
-          <w:numId w:val="1040"/>
-        </w:numPr>
-      </w:pPr>
-      <w:r>
-        <w:t xml:space="preserve">commit completed where required</w:t>
-      </w:r>
-    </w:p>
-    <w:p>
-      <w:pPr>
-        <w:pStyle w:val="Compact"/>
-        <w:numPr>
-          <w:ilvl w:val="0"/>
-          <w:numId w:val="1040"/>
-        </w:numPr>
-      </w:pPr>
-      <w:r>
-        <w:t xml:space="preserve">push completed where required</w:t>
+        <w:t xml:space="preserve">Definition of Success</w:t>
+      </w:r>
+    </w:p>
+    <w:p>
+      <w:pPr>
+        <w:pStyle w:val="FirstParagraph"/>
+      </w:pPr>
+      <w:r>
+        <w:t xml:space="preserve">A task is complete only when:</w:t>
+      </w:r>
+    </w:p>
+    <w:p>
+      <w:pPr>
+        <w:pStyle w:val="Compact"/>
+        <w:numPr>
+          <w:ilvl w:val="0"/>
+          <w:numId w:val="1041"/>
+        </w:numPr>
+      </w:pPr>
+      <w:r>
+        <w:t xml:space="preserve">the requested requirement is implemented</w:t>
+      </w:r>
+    </w:p>
+    <w:p>
+      <w:pPr>
+        <w:pStyle w:val="Compact"/>
+        <w:numPr>
+          <w:ilvl w:val="0"/>
+          <w:numId w:val="1041"/>
+        </w:numPr>
+      </w:pPr>
+      <w:r>
+        <w:t xml:space="preserve">architecture boundaries remain consistent</w:t>
+      </w:r>
+    </w:p>
+    <w:p>
+      <w:pPr>
+        <w:pStyle w:val="Compact"/>
+        <w:numPr>
+          <w:ilvl w:val="0"/>
+          <w:numId w:val="1041"/>
+        </w:numPr>
+      </w:pPr>
+      <w:r>
+        <w:t xml:space="preserve">capability ownership remains clear</w:t>
+      </w:r>
+    </w:p>
+    <w:p>
+      <w:pPr>
+        <w:pStyle w:val="Compact"/>
+        <w:numPr>
+          <w:ilvl w:val="0"/>
+          <w:numId w:val="1041"/>
+        </w:numPr>
+      </w:pPr>
+      <w:r>
+        <w:t xml:space="preserve">side effects are explicit</w:t>
+      </w:r>
+    </w:p>
+    <w:p>
+      <w:pPr>
+        <w:pStyle w:val="Compact"/>
+        <w:numPr>
+          <w:ilvl w:val="0"/>
+          <w:numId w:val="1041"/>
+        </w:numPr>
+      </w:pPr>
+      <w:r>
+        <w:t xml:space="preserve">state transitions are deterministic</w:t>
+      </w:r>
+    </w:p>
+    <w:p>
+      <w:pPr>
+        <w:pStyle w:val="Compact"/>
+        <w:numPr>
+          <w:ilvl w:val="0"/>
+          <w:numId w:val="1041"/>
+        </w:numPr>
+      </w:pPr>
+      <w:r>
+        <w:t xml:space="preserve">relevant tests pass</w:t>
+      </w:r>
+    </w:p>
+    <w:p>
+      <w:pPr>
+        <w:pStyle w:val="Compact"/>
+        <w:numPr>
+          <w:ilvl w:val="0"/>
+          <w:numId w:val="1041"/>
+        </w:numPr>
+      </w:pPr>
+      <w:r>
+        <w:t xml:space="preserve">trading regression scenarios pass where required</w:t>
+      </w:r>
+    </w:p>
+    <w:p>
+      <w:pPr>
+        <w:pStyle w:val="Compact"/>
+        <w:numPr>
+          <w:ilvl w:val="0"/>
+          <w:numId w:val="1041"/>
+        </w:numPr>
+      </w:pPr>
+      <w:r>
+        <w:t xml:space="preserve">documentation is synchronized</w:t>
+      </w:r>
+    </w:p>
+    <w:p>
+      <w:pPr>
+        <w:pStyle w:val="Compact"/>
+        <w:numPr>
+          <w:ilvl w:val="0"/>
+          <w:numId w:val="1041"/>
+        </w:numPr>
+      </w:pPr>
+      <w:r>
+        <w:t xml:space="preserve">documentation generation passes where required</w:t>
+      </w:r>
+    </w:p>
+    <w:p>
+      <w:pPr>
+        <w:pStyle w:val="Compact"/>
+        <w:numPr>
+          <w:ilvl w:val="0"/>
+          <w:numId w:val="1041"/>
+        </w:numPr>
+      </w:pPr>
+      <w:r>
+        <w:t xml:space="preserve">source quality checks pass</w:t>
+      </w:r>
+    </w:p>
+    <w:p>
+      <w:pPr>
+        <w:pStyle w:val="Compact"/>
+        <w:numPr>
+          <w:ilvl w:val="0"/>
+          <w:numId w:val="1041"/>
+        </w:numPr>
+      </w:pPr>
+      <w:r>
+        <w:t xml:space="preserve">complete diff is reviewed</w:t>
+      </w:r>
+    </w:p>
+    <w:p>
+      <w:pPr>
+        <w:pStyle w:val="Compact"/>
+        <w:numPr>
+          <w:ilvl w:val="0"/>
+          <w:numId w:val="1041"/>
+        </w:numPr>
+      </w:pPr>
+      <w:r>
+        <w:t xml:space="preserve">changes are ready for repository integration</w:t>
+      </w:r>
+    </w:p>
+    <w:p>
+      <w:pPr>
+        <w:pStyle w:val="FirstParagraph"/>
+      </w:pPr>
+      <w:r>
+        <w:t xml:space="preserve">For the standard development workflow, completion also includes commit and push.</w:t>
+      </w:r>
+    </w:p>
+    <w:p>
+      <w:pPr>
+        <w:pStyle w:val="BodyText"/>
+      </w:pPr>
+      <w:r>
+        <w:t xml:space="preserve">A task with known unresolved trading-critical behaviour is not complete.</w:t>
       </w:r>
     </w:p>
     <w:p>
@@ -6336,12 +6149,433 @@
       </w:r>
     </w:p>
     <w:bookmarkEnd w:id="49"/>
-    <w:bookmarkStart w:id="50" w:name="related-documents"/>
+    <w:bookmarkStart w:id="50" w:name="ai-agent-review-checklist"/>
     <w:p>
       <w:pPr>
         <w:pStyle w:val="Heading1"/>
       </w:pPr>
       <w:r>
+        <w:t xml:space="preserve">AI Agent Review Checklist</w:t>
+      </w:r>
+    </w:p>
+    <w:p>
+      <w:pPr>
+        <w:pStyle w:val="FirstParagraph"/>
+      </w:pPr>
+      <w:r>
+        <w:t xml:space="preserve">Before completing a task verify:</w:t>
+      </w:r>
+    </w:p>
+    <w:p>
+      <w:pPr>
+        <w:pStyle w:val="Compact"/>
+        <w:numPr>
+          <w:ilvl w:val="0"/>
+          <w:numId w:val="1042"/>
+        </w:numPr>
+      </w:pPr>
+      <w:r>
+        <w:t xml:space="preserve">current repository inspected</w:t>
+      </w:r>
+    </w:p>
+    <w:p>
+      <w:pPr>
+        <w:pStyle w:val="Compact"/>
+        <w:numPr>
+          <w:ilvl w:val="0"/>
+          <w:numId w:val="1042"/>
+        </w:numPr>
+      </w:pPr>
+      <w:r>
+        <w:t xml:space="preserve">affected files inspected</w:t>
+      </w:r>
+    </w:p>
+    <w:p>
+      <w:pPr>
+        <w:pStyle w:val="Compact"/>
+        <w:numPr>
+          <w:ilvl w:val="0"/>
+          <w:numId w:val="1042"/>
+        </w:numPr>
+      </w:pPr>
+      <w:r>
+        <w:t xml:space="preserve">direct callers inspected</w:t>
+      </w:r>
+    </w:p>
+    <w:p>
+      <w:pPr>
+        <w:pStyle w:val="Compact"/>
+        <w:numPr>
+          <w:ilvl w:val="0"/>
+          <w:numId w:val="1042"/>
+        </w:numPr>
+      </w:pPr>
+      <w:r>
+        <w:t xml:space="preserve">direct dependencies inspected</w:t>
+      </w:r>
+    </w:p>
+    <w:p>
+      <w:pPr>
+        <w:pStyle w:val="Compact"/>
+        <w:numPr>
+          <w:ilvl w:val="0"/>
+          <w:numId w:val="1042"/>
+        </w:numPr>
+      </w:pPr>
+      <w:r>
+        <w:t xml:space="preserve">related tests inspected</w:t>
+      </w:r>
+    </w:p>
+    <w:p>
+      <w:pPr>
+        <w:pStyle w:val="Compact"/>
+        <w:numPr>
+          <w:ilvl w:val="0"/>
+          <w:numId w:val="1042"/>
+        </w:numPr>
+      </w:pPr>
+      <w:r>
+        <w:t xml:space="preserve">related Markdown documentation inspected</w:t>
+      </w:r>
+    </w:p>
+    <w:p>
+      <w:pPr>
+        <w:pStyle w:val="Compact"/>
+        <w:numPr>
+          <w:ilvl w:val="0"/>
+          <w:numId w:val="1042"/>
+        </w:numPr>
+      </w:pPr>
+      <w:r>
+        <w:t xml:space="preserve">owning capability identified</w:t>
+      </w:r>
+    </w:p>
+    <w:p>
+      <w:pPr>
+        <w:pStyle w:val="Compact"/>
+        <w:numPr>
+          <w:ilvl w:val="0"/>
+          <w:numId w:val="1042"/>
+        </w:numPr>
+      </w:pPr>
+      <w:r>
+        <w:t xml:space="preserve">architecture layer identified</w:t>
+      </w:r>
+    </w:p>
+    <w:p>
+      <w:pPr>
+        <w:pStyle w:val="Compact"/>
+        <w:numPr>
+          <w:ilvl w:val="0"/>
+          <w:numId w:val="1042"/>
+        </w:numPr>
+      </w:pPr>
+      <w:r>
+        <w:t xml:space="preserve">smallest meaningful change selected</w:t>
+      </w:r>
+    </w:p>
+    <w:p>
+      <w:pPr>
+        <w:pStyle w:val="Compact"/>
+        <w:numPr>
+          <w:ilvl w:val="0"/>
+          <w:numId w:val="1042"/>
+        </w:numPr>
+      </w:pPr>
+      <w:r>
+        <w:t xml:space="preserve">no repository details invented</w:t>
+      </w:r>
+    </w:p>
+    <w:p>
+      <w:pPr>
+        <w:pStyle w:val="Compact"/>
+        <w:numPr>
+          <w:ilvl w:val="0"/>
+          <w:numId w:val="1042"/>
+        </w:numPr>
+      </w:pPr>
+      <w:r>
+        <w:t xml:space="preserve">side effects identified</w:t>
+      </w:r>
+    </w:p>
+    <w:p>
+      <w:pPr>
+        <w:pStyle w:val="Compact"/>
+        <w:numPr>
+          <w:ilvl w:val="0"/>
+          <w:numId w:val="1042"/>
+        </w:numPr>
+      </w:pPr>
+      <w:r>
+        <w:t xml:space="preserve">state transitions identified</w:t>
+      </w:r>
+    </w:p>
+    <w:p>
+      <w:pPr>
+        <w:pStyle w:val="Compact"/>
+        <w:numPr>
+          <w:ilvl w:val="0"/>
+          <w:numId w:val="1042"/>
+        </w:numPr>
+      </w:pPr>
+      <w:r>
+        <w:t xml:space="preserve">financial availability semantics preserved</w:t>
+      </w:r>
+    </w:p>
+    <w:p>
+      <w:pPr>
+        <w:pStyle w:val="Compact"/>
+        <w:numPr>
+          <w:ilvl w:val="0"/>
+          <w:numId w:val="1042"/>
+        </w:numPr>
+      </w:pPr>
+      <w:r>
+        <w:t xml:space="preserve">async task ownership evaluated</w:t>
+      </w:r>
+    </w:p>
+    <w:p>
+      <w:pPr>
+        <w:pStyle w:val="Compact"/>
+        <w:numPr>
+          <w:ilvl w:val="0"/>
+          <w:numId w:val="1042"/>
+        </w:numPr>
+      </w:pPr>
+      <w:r>
+        <w:t xml:space="preserve">timeout behaviour evaluated</w:t>
+      </w:r>
+    </w:p>
+    <w:p>
+      <w:pPr>
+        <w:pStyle w:val="Compact"/>
+        <w:numPr>
+          <w:ilvl w:val="0"/>
+          <w:numId w:val="1042"/>
+        </w:numPr>
+      </w:pPr>
+      <w:r>
+        <w:t xml:space="preserve">cancellation evaluated</w:t>
+      </w:r>
+    </w:p>
+    <w:p>
+      <w:pPr>
+        <w:pStyle w:val="Compact"/>
+        <w:numPr>
+          <w:ilvl w:val="0"/>
+          <w:numId w:val="1042"/>
+        </w:numPr>
+      </w:pPr>
+      <w:r>
+        <w:t xml:space="preserve">duplicate submission risk evaluated where relevant</w:t>
+      </w:r>
+    </w:p>
+    <w:p>
+      <w:pPr>
+        <w:pStyle w:val="Compact"/>
+        <w:numPr>
+          <w:ilvl w:val="0"/>
+          <w:numId w:val="1042"/>
+        </w:numPr>
+      </w:pPr>
+      <w:r>
+        <w:t xml:space="preserve">retry behaviour evaluated where relevant</w:t>
+      </w:r>
+    </w:p>
+    <w:p>
+      <w:pPr>
+        <w:pStyle w:val="Compact"/>
+        <w:numPr>
+          <w:ilvl w:val="0"/>
+          <w:numId w:val="1042"/>
+        </w:numPr>
+      </w:pPr>
+      <w:r>
+        <w:t xml:space="preserve">broker acknowledgement semantics evaluated where relevant</w:t>
+      </w:r>
+    </w:p>
+    <w:p>
+      <w:pPr>
+        <w:pStyle w:val="Compact"/>
+        <w:numPr>
+          <w:ilvl w:val="0"/>
+          <w:numId w:val="1042"/>
+        </w:numPr>
+      </w:pPr>
+      <w:r>
+        <w:t xml:space="preserve">reconnect behaviour evaluated where relevant</w:t>
+      </w:r>
+    </w:p>
+    <w:p>
+      <w:pPr>
+        <w:pStyle w:val="Compact"/>
+        <w:numPr>
+          <w:ilvl w:val="0"/>
+          <w:numId w:val="1042"/>
+        </w:numPr>
+      </w:pPr>
+      <w:r>
+        <w:t xml:space="preserve">reconciliation impact evaluated where relevant</w:t>
+      </w:r>
+    </w:p>
+    <w:p>
+      <w:pPr>
+        <w:pStyle w:val="Compact"/>
+        <w:numPr>
+          <w:ilvl w:val="0"/>
+          <w:numId w:val="1042"/>
+        </w:numPr>
+      </w:pPr>
+      <w:r>
+        <w:t xml:space="preserve">PAPER and LIVE impact evaluated where relevant</w:t>
+      </w:r>
+    </w:p>
+    <w:p>
+      <w:pPr>
+        <w:pStyle w:val="Compact"/>
+        <w:numPr>
+          <w:ilvl w:val="0"/>
+          <w:numId w:val="1042"/>
+        </w:numPr>
+      </w:pPr>
+      <w:r>
+        <w:t xml:space="preserve">tests added or updated</w:t>
+      </w:r>
+    </w:p>
+    <w:p>
+      <w:pPr>
+        <w:pStyle w:val="Compact"/>
+        <w:numPr>
+          <w:ilvl w:val="0"/>
+          <w:numId w:val="1042"/>
+        </w:numPr>
+      </w:pPr>
+      <w:r>
+        <w:t xml:space="preserve">focused tests passed</w:t>
+      </w:r>
+    </w:p>
+    <w:p>
+      <w:pPr>
+        <w:pStyle w:val="Compact"/>
+        <w:numPr>
+          <w:ilvl w:val="0"/>
+          <w:numId w:val="1042"/>
+        </w:numPr>
+      </w:pPr>
+      <w:r>
+        <w:t xml:space="preserve">required regression tests passed</w:t>
+      </w:r>
+    </w:p>
+    <w:p>
+      <w:pPr>
+        <w:pStyle w:val="Compact"/>
+        <w:numPr>
+          <w:ilvl w:val="0"/>
+          <w:numId w:val="1042"/>
+        </w:numPr>
+      </w:pPr>
+      <w:r>
+        <w:t xml:space="preserve">Ruff passed</w:t>
+      </w:r>
+    </w:p>
+    <w:p>
+      <w:pPr>
+        <w:pStyle w:val="Compact"/>
+        <w:numPr>
+          <w:ilvl w:val="0"/>
+          <w:numId w:val="1042"/>
+        </w:numPr>
+      </w:pPr>
+      <w:r>
+        <w:t xml:space="preserve">formatting verification passed</w:t>
+      </w:r>
+    </w:p>
+    <w:p>
+      <w:pPr>
+        <w:pStyle w:val="Compact"/>
+        <w:numPr>
+          <w:ilvl w:val="0"/>
+          <w:numId w:val="1042"/>
+        </w:numPr>
+      </w:pPr>
+      <w:r>
+        <w:t xml:space="preserve">documentation synchronized</w:t>
+      </w:r>
+    </w:p>
+    <w:p>
+      <w:pPr>
+        <w:pStyle w:val="Compact"/>
+        <w:numPr>
+          <w:ilvl w:val="0"/>
+          <w:numId w:val="1042"/>
+        </w:numPr>
+      </w:pPr>
+      <w:r>
+        <w:t xml:space="preserve">documentation generation passed where required</w:t>
+      </w:r>
+    </w:p>
+    <w:p>
+      <w:pPr>
+        <w:pStyle w:val="Compact"/>
+        <w:numPr>
+          <w:ilvl w:val="0"/>
+          <w:numId w:val="1042"/>
+        </w:numPr>
+      </w:pPr>
+      <w:r>
+        <w:t xml:space="preserve">complete diff reviewed</w:t>
+      </w:r>
+    </w:p>
+    <w:p>
+      <w:pPr>
+        <w:pStyle w:val="Compact"/>
+        <w:numPr>
+          <w:ilvl w:val="0"/>
+          <w:numId w:val="1042"/>
+        </w:numPr>
+      </w:pPr>
+      <w:r>
+        <w:t xml:space="preserve">no secrets exposed</w:t>
+      </w:r>
+    </w:p>
+    <w:p>
+      <w:pPr>
+        <w:pStyle w:val="Compact"/>
+        <w:numPr>
+          <w:ilvl w:val="0"/>
+          <w:numId w:val="1042"/>
+        </w:numPr>
+      </w:pPr>
+      <w:r>
+        <w:t xml:space="preserve">commit completed where required</w:t>
+      </w:r>
+    </w:p>
+    <w:p>
+      <w:pPr>
+        <w:pStyle w:val="Compact"/>
+        <w:numPr>
+          <w:ilvl w:val="0"/>
+          <w:numId w:val="1042"/>
+        </w:numPr>
+      </w:pPr>
+      <w:r>
+        <w:t xml:space="preserve">push completed where required</w:t>
+      </w:r>
+    </w:p>
+    <w:p>
+      <w:r>
+        <w:pict>
+          <v:rect style="width:0;height:1.5pt" o:hralign="center" o:hrstd="t" o:hr="t"/>
+        </w:pict>
+      </w:r>
+    </w:p>
+    <w:bookmarkEnd w:id="50"/>
+    <w:bookmarkStart w:id="51" w:name="related-documents"/>
+    <w:p>
+      <w:pPr>
+        <w:pStyle w:val="Heading1"/>
+      </w:pPr>
+      <w:r>
         <w:t xml:space="preserve">Related Documents</w:t>
       </w:r>
     </w:p>
@@ -6350,7 +6584,7 @@
         <w:pStyle w:val="Compact"/>
         <w:numPr>
           <w:ilvl w:val="0"/>
-          <w:numId w:val="1041"/>
+          <w:numId w:val="1043"/>
         </w:numPr>
       </w:pPr>
       <w:r>
@@ -6362,7 +6596,7 @@
         <w:pStyle w:val="Compact"/>
         <w:numPr>
           <w:ilvl w:val="0"/>
-          <w:numId w:val="1041"/>
+          <w:numId w:val="1043"/>
         </w:numPr>
       </w:pPr>
       <w:r>
@@ -6374,7 +6608,7 @@
         <w:pStyle w:val="Compact"/>
         <w:numPr>
           <w:ilvl w:val="0"/>
-          <w:numId w:val="1041"/>
+          <w:numId w:val="1043"/>
         </w:numPr>
       </w:pPr>
       <w:r>
@@ -6386,7 +6620,7 @@
         <w:pStyle w:val="Compact"/>
         <w:numPr>
           <w:ilvl w:val="0"/>
-          <w:numId w:val="1041"/>
+          <w:numId w:val="1043"/>
         </w:numPr>
       </w:pPr>
       <w:r>
@@ -6398,7 +6632,7 @@
         <w:pStyle w:val="Compact"/>
         <w:numPr>
           <w:ilvl w:val="0"/>
-          <w:numId w:val="1041"/>
+          <w:numId w:val="1043"/>
         </w:numPr>
       </w:pPr>
       <w:r>
@@ -6410,7 +6644,7 @@
         <w:pStyle w:val="Compact"/>
         <w:numPr>
           <w:ilvl w:val="0"/>
-          <w:numId w:val="1041"/>
+          <w:numId w:val="1043"/>
         </w:numPr>
       </w:pPr>
       <w:r>
@@ -6422,7 +6656,7 @@
         <w:pStyle w:val="Compact"/>
         <w:numPr>
           <w:ilvl w:val="0"/>
-          <w:numId w:val="1041"/>
+          <w:numId w:val="1043"/>
         </w:numPr>
       </w:pPr>
       <w:r>
@@ -6434,7 +6668,7 @@
         <w:pStyle w:val="Compact"/>
         <w:numPr>
           <w:ilvl w:val="0"/>
-          <w:numId w:val="1041"/>
+          <w:numId w:val="1043"/>
         </w:numPr>
       </w:pPr>
       <w:r>
@@ -6446,7 +6680,7 @@
         <w:pStyle w:val="Compact"/>
         <w:numPr>
           <w:ilvl w:val="0"/>
-          <w:numId w:val="1041"/>
+          <w:numId w:val="1043"/>
         </w:numPr>
       </w:pPr>
       <w:r>
@@ -6458,7 +6692,7 @@
         <w:pStyle w:val="Compact"/>
         <w:numPr>
           <w:ilvl w:val="0"/>
-          <w:numId w:val="1041"/>
+          <w:numId w:val="1043"/>
         </w:numPr>
       </w:pPr>
       <w:r>
@@ -6470,7 +6704,7 @@
         <w:pStyle w:val="Compact"/>
         <w:numPr>
           <w:ilvl w:val="0"/>
-          <w:numId w:val="1041"/>
+          <w:numId w:val="1043"/>
         </w:numPr>
       </w:pPr>
       <w:r>
@@ -6482,7 +6716,7 @@
         <w:pStyle w:val="Compact"/>
         <w:numPr>
           <w:ilvl w:val="0"/>
-          <w:numId w:val="1041"/>
+          <w:numId w:val="1043"/>
         </w:numPr>
       </w:pPr>
       <w:r>
@@ -6494,7 +6728,7 @@
         <w:pStyle w:val="Compact"/>
         <w:numPr>
           <w:ilvl w:val="0"/>
-          <w:numId w:val="1041"/>
+          <w:numId w:val="1043"/>
         </w:numPr>
       </w:pPr>
       <w:r>
@@ -6506,7 +6740,7 @@
         <w:pStyle w:val="Compact"/>
         <w:numPr>
           <w:ilvl w:val="0"/>
-          <w:numId w:val="1041"/>
+          <w:numId w:val="1043"/>
         </w:numPr>
       </w:pPr>
       <w:r>
@@ -6518,7 +6752,7 @@
         <w:pStyle w:val="Compact"/>
         <w:numPr>
           <w:ilvl w:val="0"/>
-          <w:numId w:val="1041"/>
+          <w:numId w:val="1043"/>
         </w:numPr>
       </w:pPr>
       <w:r>
@@ -6530,7 +6764,7 @@
         <w:pStyle w:val="Compact"/>
         <w:numPr>
           <w:ilvl w:val="0"/>
-          <w:numId w:val="1041"/>
+          <w:numId w:val="1043"/>
         </w:numPr>
       </w:pPr>
       <w:r>
@@ -6542,7 +6776,7 @@
         <w:pStyle w:val="Compact"/>
         <w:numPr>
           <w:ilvl w:val="0"/>
-          <w:numId w:val="1041"/>
+          <w:numId w:val="1043"/>
         </w:numPr>
       </w:pPr>
       <w:r>
@@ -6554,14 +6788,14 @@
         <w:pStyle w:val="Compact"/>
         <w:numPr>
           <w:ilvl w:val="0"/>
-          <w:numId w:val="1041"/>
+          <w:numId w:val="1043"/>
         </w:numPr>
       </w:pPr>
       <w:r>
         <w:t xml:space="preserve">AGENTS.md</w:t>
       </w:r>
     </w:p>
-    <w:bookmarkEnd w:id="50"/>
+    <w:bookmarkEnd w:id="51"/>
     <w:sectPr>
       <w:footnotePr>
         <w:numRestart w:val="eachSect"/>
@@ -7092,6 +7326,12 @@
     <w:abstractNumId w:val="991"/>
   </w:num>
   <w:num w:numId="1041">
+    <w:abstractNumId w:val="991"/>
+  </w:num>
+  <w:num w:numId="1042">
+    <w:abstractNumId w:val="991"/>
+  </w:num>
+  <w:num w:numId="1043">
     <w:abstractNumId w:val="991"/>
   </w:num>
 </w:numbering>

</xml_diff>